<commit_message>
Permitir configurar la URL de la API y la carpeta de descarga por terminal
</commit_message>
<xml_diff>
--- a/documentation/technical-guide.docx
+++ b/documentation/technical-guide.docx
@@ -12,12 +12,12 @@
     </w:p>
     <w:p>
       <w:r>
-        <w:t>Updated: October 9, 2026. Language: English.</w:t>
+        <w:t>Updated: October 12, 2026. Language: English.</w:t>
       </w:r>
     </w:p>
     <w:p>
       <w:r>
-        <w:t>This guide describes the retained first Windows distribution, TytanUpdater-win-x64-20261009-094714-e05a10, and the source restored by commit 9001bc9. Its application behavior matches the initial distribution commit 45122ab. Documentation changes do not change the executables or the retained ZIP.</w:t>
+        <w:t>This guide describes the current source, including the October 12 configurable API URL and optional CLI destination parameter. Preserved October 9 ZIPs retain their original behavior and require replacement with a new build to use these additions. Historical release checks below are labelled separately.</w:t>
       </w:r>
     </w:p>
     <w:p>
@@ -1424,7 +1424,7 @@
     </w:p>
     <w:p>
       <w:r>
-        <w:t>The CLI uses exactly two positional arguments:</w:t>
+        <w:t>The CLI uses two required positional arguments and an optional destination directory:</w:t>
       </w:r>
     </w:p>
     <w:p>
@@ -1438,7 +1438,7 @@
     </w:p>
     <w:p>
       <w:r>
-        <w:t>The first is one cloud client folder name. The second is a name, not a path: the last underscore separates the product from the installed version. No JSON or actual folder with this name is needed. No third destination argument is supported.</w:t>
+        <w:t>The first is one cloud client folder name. The second is a name, not a path: the last underscore separates the product from the installed version. No JSON or actual folder with this name is needed. The optional third argument is validated as an existing directory before HTTP; its absolute path is combined with the validated server ZIP name. It bypasses the destination chooser and never overwrites existing files.</w:t>
       </w:r>
     </w:p>
     <w:p>
@@ -1471,7 +1471,7 @@
     </w:p>
     <w:p>
       <w:r>
-        <w:t>Program reads TYTAN_API_USERNAME (default TytanSQL) and TYTAN_API_PASSWORD (required). It installs a Console.CancelKeyPress handler that cancels the shared token. RunAsync lists, compares, writes the comparison line, and opens Save As only for a newer package. If the server version is equal or older it writes No updates available. A missing matching package is an error, not an up-to-date result.</w:t>
+        <w:t>Program reads TYTAN_API_USERNAME (default TytanSQL) and TYTAN_API_PASSWORD (required). It installs a Console.CancelKeyPress handler that cancels the shared token. RunAsync lists, compares, writes the comparison line, and opens Save As only for a newer package when no destination parameter is supplied. If the server version is equal or older it writes No updates available. A missing matching package is an error, not an up-to-date result.</w:t>
       </w:r>
     </w:p>
     <w:p>
@@ -1480,7 +1480,7 @@
         <w:shd w:fill="F2F4F7"/>
       </w:pPr>
       <w:r>
-        <w:t>string? destination = await (chooseDestination ?? DownloadLocation.ChooseAsync)(update.Package.Name, token);</w:t>
+        <w:t>destination = await (chooseDestination ?? DownloadLocation.ChooseAsync)(update.Package.Name, token);</w:t>
       </w:r>
     </w:p>
     <w:p>
@@ -1539,7 +1539,7 @@
     </w:p>
     <w:p>
       <w:r>
-        <w:t>The chooser is injectable for local tests. The production implementation creates SaveFileDialog on a dedicated background STA thread, because async console continuations run on thread-pool threads. TaskCompletionSource returns the selected full path; WaitAsync(token) allows Ctrl+C to end the wait. The background thread does not keep the CLI process alive when Main finishes. An interactive Windows session is required.</w:t>
+        <w:t>The chooser is injectable for local tests. The production implementation creates SaveFileDialog on a dedicated background STA thread, because async console continuations run on thread-pool threads. TaskCompletionSource returns the selected full path; WaitAsync(token) allows Ctrl+C to end the wait. The background thread does not keep the CLI process alive when Main finishes. An interactive Windows session is required for the chooser; the third-argument download mode does not open a dialog.</w:t>
       </w:r>
     </w:p>
     <w:p>
@@ -1681,6 +1681,249 @@
     <w:p>
       <w:r>
         <w:t>--help/-h prints help without credentials or a request. --self-test runs local checks. Double-clicking the console EXE without arguments prints usage then exits; run it from PowerShell to see the output and provide parameters.</w:t>
+      </w:r>
+    </w:p>
+    <w:p>
+      <w:pPr>
+        <w:pStyle w:val="Heading1"/>
+      </w:pPr>
+      <w:r>
+        <w:t>Server configuration</w:t>
+      </w:r>
+    </w:p>
+    <w:p>
+      <w:r>
+        <w:t xml:space="preserve">Both Windows applications read </w:t>
+      </w:r>
+      <w:r>
+        <w:rPr>
+          <w:rFonts w:ascii="Consolas" w:hAnsi="Consolas"/>
+          <w:sz w:val="18"/>
+        </w:rPr>
+        <w:t>TYTAN_API_BASE_URL</w:t>
+      </w:r>
+      <w:r>
+        <w:t xml:space="preserve"> at startup. If it is unset, they use </w:t>
+      </w:r>
+      <w:r>
+        <w:rPr>
+          <w:rFonts w:ascii="Consolas" w:hAnsi="Consolas"/>
+          <w:sz w:val="18"/>
+        </w:rPr>
+        <w:t>https://tytan.poznan.pl/SQLupdate/</w:t>
+      </w:r>
+      <w:r>
+        <w:t>. To change the server without rebuilding:</w:t>
+      </w:r>
+    </w:p>
+    <w:p>
+      <w:pPr>
+        <w:pStyle w:val="CodeBlock"/>
+        <w:shd w:fill="F2F4F7"/>
+      </w:pPr>
+      <w:r>
+        <w:t>$env:TYTAN_API_BASE_URL = 'https://updates.example.com/SQLupdate/'</w:t>
+      </w:r>
+    </w:p>
+    <w:p>
+      <w:r>
+        <w:t xml:space="preserve">Use the HTTPS directory containing both </w:t>
+      </w:r>
+      <w:r>
+        <w:rPr>
+          <w:rFonts w:ascii="Consolas" w:hAnsi="Consolas"/>
+          <w:sz w:val="18"/>
+        </w:rPr>
+        <w:t>api.php</w:t>
+      </w:r>
+      <w:r>
+        <w:t xml:space="preserve"> and </w:t>
+      </w:r>
+      <w:r>
+        <w:rPr>
+          <w:rFonts w:ascii="Consolas" w:hAnsi="Consolas"/>
+          <w:sz w:val="18"/>
+        </w:rPr>
+        <w:t>download.php</w:t>
+      </w:r>
+      <w:r>
+        <w:t xml:space="preserve">, with a trailing slash. Do not enter the full </w:t>
+      </w:r>
+      <w:r>
+        <w:rPr>
+          <w:rFonts w:ascii="Consolas" w:hAnsi="Consolas"/>
+          <w:sz w:val="18"/>
+        </w:rPr>
+        <w:t>api.php</w:t>
+      </w:r>
+      <w:r>
+        <w:t xml:space="preserve"> URL. HTTP, embedded credentials, query strings, fragments, and invalid URLs are rejected. Restart the application after changing its environment. To restore the default, run </w:t>
+      </w:r>
+      <w:r>
+        <w:rPr>
+          <w:rFonts w:ascii="Consolas" w:hAnsi="Consolas"/>
+          <w:sz w:val="18"/>
+        </w:rPr>
+        <w:t>Remove-Item Env:TYTAN_API_BASE_URL</w:t>
+      </w:r>
+      <w:r>
+        <w:t xml:space="preserve"> in the same terminal before starting it again. These commands configure only that terminal and applications launched from it.</w:t>
+      </w:r>
+    </w:p>
+    <w:p>
+      <w:r>
+        <w:t xml:space="preserve">Credentials are configured separately. Set </w:t>
+      </w:r>
+      <w:r>
+        <w:rPr>
+          <w:rFonts w:ascii="Consolas" w:hAnsi="Consolas"/>
+          <w:sz w:val="18"/>
+        </w:rPr>
+        <w:t>TYTAN_API_USERNAME</w:t>
+      </w:r>
+      <w:r>
+        <w:t xml:space="preserve"> and </w:t>
+      </w:r>
+      <w:r>
+        <w:rPr>
+          <w:rFonts w:ascii="Consolas" w:hAnsi="Consolas"/>
+          <w:sz w:val="18"/>
+        </w:rPr>
+        <w:t>TYTAN_API_PASSWORD</w:t>
+      </w:r>
+      <w:r>
+        <w:t xml:space="preserve"> for the console; the desktop also allows entering them in its fields. The administrator changes the actual account on the hosting server. Changing credentials does not require rebuilding. The new server must expose the same endpoint names, JSON contract, and BasicAuth behavior; a URL change alone cannot adapt a different API.</w:t>
+      </w:r>
+    </w:p>
+    <w:p>
+      <w:r/>
+      <w:r>
+        <w:rPr>
+          <w:rFonts w:ascii="Consolas" w:hAnsi="Consolas"/>
+          <w:sz w:val="18"/>
+        </w:rPr>
+        <w:t>CloudApiClient.ResolveBaseUri</w:t>
+      </w:r>
+      <w:r>
+        <w:t xml:space="preserve"> parses the environment setting or uses </w:t>
+      </w:r>
+      <w:r>
+        <w:rPr>
+          <w:rFonts w:ascii="Consolas" w:hAnsi="Consolas"/>
+          <w:sz w:val="18"/>
+        </w:rPr>
+        <w:t>DefaultBaseUrl</w:t>
+      </w:r>
+      <w:r>
+        <w:t>. The constructor gives an explicitly injected URI precedence over the environment, preserving test/integration injection. Invalid configuration produces an English console error with exit code 1, or a desktop error dialog. HTTPS remains mandatory; the PHP server is unchanged.</w:t>
+      </w:r>
+    </w:p>
+    <w:p>
+      <w:pPr>
+        <w:pStyle w:val="CodeBlock"/>
+        <w:shd w:fill="F2F4F7"/>
+      </w:pPr>
+      <w:r>
+        <w:t>internal static Uri ResolveBaseUri(string? configuredUrl)</w:t>
+      </w:r>
+    </w:p>
+    <w:p>
+      <w:pPr>
+        <w:pStyle w:val="CodeBlock"/>
+        <w:shd w:fill="F2F4F7"/>
+      </w:pPr>
+      <w:r>
+        <w:t xml:space="preserve">    {</w:t>
+      </w:r>
+    </w:p>
+    <w:p>
+      <w:pPr>
+        <w:pStyle w:val="CodeBlock"/>
+        <w:shd w:fill="F2F4F7"/>
+      </w:pPr>
+      <w:r>
+        <w:t xml:space="preserve">        string value = configuredUrl ?? DefaultBaseUrl;</w:t>
+      </w:r>
+    </w:p>
+    <w:p>
+      <w:pPr>
+        <w:pStyle w:val="CodeBlock"/>
+        <w:shd w:fill="F2F4F7"/>
+      </w:pPr>
+      <w:r>
+        <w:t xml:space="preserve">        if (!Uri.TryCreate(value, UriKind.Absolute, out Uri? uri) || uri.Scheme != "https" ||</w:t>
+      </w:r>
+    </w:p>
+    <w:p>
+      <w:pPr>
+        <w:pStyle w:val="CodeBlock"/>
+        <w:shd w:fill="F2F4F7"/>
+      </w:pPr>
+      <w:r>
+        <w:t xml:space="preserve">            uri.UserInfo != "" || uri.Query != "" || uri.Fragment != "" ||</w:t>
+      </w:r>
+    </w:p>
+    <w:p>
+      <w:pPr>
+        <w:pStyle w:val="CodeBlock"/>
+        <w:shd w:fill="F2F4F7"/>
+      </w:pPr>
+      <w:r>
+        <w:t xml:space="preserve">            !uri.AbsolutePath.EndsWith('/'))</w:t>
+      </w:r>
+    </w:p>
+    <w:p>
+      <w:pPr>
+        <w:pStyle w:val="CodeBlock"/>
+        <w:shd w:fill="F2F4F7"/>
+      </w:pPr>
+      <w:r>
+        <w:t xml:space="preserve">        {</w:t>
+      </w:r>
+    </w:p>
+    <w:p>
+      <w:pPr>
+        <w:pStyle w:val="CodeBlock"/>
+        <w:shd w:fill="F2F4F7"/>
+      </w:pPr>
+      <w:r>
+        <w:t xml:space="preserve">            throw new ArgumentException("TYTAN_API_BASE_URL must be an HTTPS directory URL ending with '/', without credentials, a query or a fragment (not api.php).");</w:t>
+      </w:r>
+    </w:p>
+    <w:p>
+      <w:pPr>
+        <w:pStyle w:val="CodeBlock"/>
+        <w:shd w:fill="F2F4F7"/>
+      </w:pPr>
+      <w:r>
+        <w:t xml:space="preserve">        }</w:t>
+      </w:r>
+    </w:p>
+    <w:p>
+      <w:pPr>
+        <w:pStyle w:val="CodeBlock"/>
+        <w:shd w:fill="F2F4F7"/>
+      </w:pPr>
+      <w:r>
+        <w:t xml:space="preserve">        return uri;</w:t>
+      </w:r>
+    </w:p>
+    <w:p>
+      <w:pPr>
+        <w:pStyle w:val="CodeBlock"/>
+        <w:shd w:fill="F2F4F7"/>
+      </w:pPr>
+      <w:r>
+        <w:t xml:space="preserve">    }</w:t>
+      </w:r>
+    </w:p>
+    <w:p>
+      <w:pPr>
+        <w:pStyle w:val="CodeBlock"/>
+        <w:shd w:fill="F2F4F7"/>
+      </w:pPr>
+      <w:r>
+        <w:t xml:space="preserve"> </w:t>
       </w:r>
     </w:p>
     <w:p>
@@ -3657,7 +3900,7 @@
               <w:rPr>
                 <w:b/>
               </w:rPr>
-              <w:t>Count in retained Windows version</w:t>
+              <w:t>Count in current source</w:t>
             </w:r>
           </w:p>
         </w:tc>
@@ -3820,7 +4063,7 @@
           </w:tcPr>
           <w:p>
             <w:r>
-              <w:t>24</w:t>
+              <w:t>42</w:t>
             </w:r>
           </w:p>
         </w:tc>
@@ -3830,7 +4073,7 @@
           </w:tcPr>
           <w:p>
             <w:r>
-              <w:t>Two-name input, authenticated query/download, selected path, chooser cancellation, errors, help</w:t>
+              <w:t>Two/three-argument input, direct destination validation, custom URLs/environment settings, authenticated transfers, cancellation, errors, help</w:t>
             </w:r>
           </w:p>
         </w:tc>
@@ -3852,7 +4095,7 @@
           </w:tcPr>
           <w:p>
             <w:r>
-              <w:t>91</w:t>
+              <w:t>109</w:t>
             </w:r>
           </w:p>
         </w:tc>
@@ -3869,6 +4112,22 @@
       </w:tr>
     </w:tbl>
     <w:p/>
+    <w:p>
+      <w:r>
+        <w:t xml:space="preserve">On October 12, both newly published win-x86 and win-x64 packages passed these 109 checks per architecture. The x86 run used WOW64 on the development computer. No live server request was made. Package filenames and hashes are recorded in </w:t>
+      </w:r>
+      <w:hyperlink r:id="rId9">
+        <w:r>
+          <w:rPr>
+            <w:rStyle w:val="Hyperlink"/>
+          </w:rPr>
+          <w:t>Windows distribution</w:t>
+        </w:r>
+      </w:hyperlink>
+      <w:r>
+        <w:t>.</w:t>
+      </w:r>
+    </w:p>
     <w:p>
       <w:r>
         <w:t>The PHP harness independently launches actual temporary PHP servers, creates owned ZIP fixtures, exercises endpoints/configuration failures, and cleans up. A server-only test run needs Python and PHP, not .NET.</w:t>
@@ -3967,7 +4226,7 @@
       <w:r>
         <w:t xml:space="preserve">For end-user instructions, see </w:t>
       </w:r>
-      <w:hyperlink r:id="rId9">
+      <w:hyperlink r:id="rId10">
         <w:r>
           <w:rPr>
             <w:rStyle w:val="Hyperlink"/>
@@ -3978,7 +4237,7 @@
       <w:r>
         <w:t xml:space="preserve">. For the PHP-specific walkthrough with additional endpoint excerpts, see </w:t>
       </w:r>
-      <w:hyperlink r:id="rId10">
+      <w:hyperlink r:id="rId11">
         <w:r>
           <w:rPr>
             <w:rStyle w:val="Hyperlink"/>
@@ -3989,7 +4248,7 @@
       <w:r>
         <w:t xml:space="preserve">. Deployment details remain in </w:t>
       </w:r>
-      <w:hyperlink r:id="rId11">
+      <w:hyperlink r:id="rId12">
         <w:r>
           <w:rPr>
             <w:rStyle w:val="Hyperlink"/>
@@ -4002,8 +4261,8 @@
       </w:r>
     </w:p>
     <w:sectPr>
-      <w:headerReference w:type="default" r:id="rId12"/>
-      <w:footerReference w:type="default" r:id="rId13"/>
+      <w:headerReference w:type="default" r:id="rId13"/>
+      <w:footerReference w:type="default" r:id="rId14"/>
       <w:pgSz w:w="11906" w:h="16838"/>
       <w:pgMar w:top="1134" w:right="1020" w:bottom="1134" w:left="1020" w:header="720" w:footer="720" w:gutter="0"/>
       <w:cols w:space="720"/>

</xml_diff>

<commit_message>
Añadir configuración opcional con archivo .env para ambas aplicaciones
</commit_message>
<xml_diff>
--- a/documentation/technical-guide.docx
+++ b/documentation/technical-guide.docx
@@ -1688,7 +1688,443 @@
         <w:pStyle w:val="Heading1"/>
       </w:pPr>
       <w:r>
+        <w:t>Startup configuration implementation</w:t>
+      </w:r>
+    </w:p>
+    <w:p>
+      <w:r/>
+      <w:r>
+        <w:rPr>
+          <w:rFonts w:ascii="Consolas" w:hAnsi="Consolas"/>
+          <w:sz w:val="18"/>
+        </w:rPr>
+        <w:t>StartupConfiguration.Load</w:t>
+      </w:r>
+      <w:r>
+        <w:t xml:space="preserve"> is called before constructing the API client or main window. It reads </w:t>
+      </w:r>
+      <w:r>
+        <w:rPr>
+          <w:rFonts w:ascii="Consolas" w:hAnsi="Consolas"/>
+          <w:sz w:val="18"/>
+        </w:rPr>
+        <w:t>Path.Combine(AppContext.BaseDirectory, ".env")</w:t>
+      </w:r>
+      <w:r>
+        <w:t xml:space="preserve">, parses all entries, and fills only unset process environment variables. Existing URL resolution and credential fields then consume the merged values. Startup IO, syntax, and URL errors produce an English console error (exit 1) or a desktop error dialog. Missing </w:t>
+      </w:r>
+      <w:r>
+        <w:rPr>
+          <w:rFonts w:ascii="Consolas" w:hAnsi="Consolas"/>
+          <w:sz w:val="18"/>
+        </w:rPr>
+        <w:t>.env</w:t>
+      </w:r>
+      <w:r>
+        <w:t xml:space="preserve"> is accepted. </w:t>
+      </w:r>
+      <w:r>
+        <w:rPr>
+          <w:rFonts w:ascii="Consolas" w:hAnsi="Consolas"/>
+          <w:sz w:val="18"/>
+        </w:rPr>
+        <w:t>--self-test</w:t>
+      </w:r>
+      <w:r>
+        <w:t xml:space="preserve"> skips the user's file and runs isolated configuration fixtures instead; both projects compile the same loader and shared checks.</w:t>
+      </w:r>
+    </w:p>
+    <w:p>
+      <w:pPr>
+        <w:pStyle w:val="CodeBlock"/>
+        <w:shd w:fill="F2F4F7"/>
+      </w:pPr>
+      <w:r>
+        <w:t>internal static void Load()</w:t>
+      </w:r>
+    </w:p>
+    <w:p>
+      <w:pPr>
+        <w:pStyle w:val="CodeBlock"/>
+        <w:shd w:fill="F2F4F7"/>
+      </w:pPr>
+      <w:r>
+        <w:t xml:space="preserve">    {</w:t>
+      </w:r>
+    </w:p>
+    <w:p>
+      <w:pPr>
+        <w:pStyle w:val="CodeBlock"/>
+        <w:shd w:fill="F2F4F7"/>
+      </w:pPr>
+      <w:r>
+        <w:t xml:space="preserve">        // Resolve next to the executable, independently of the working directory.</w:t>
+      </w:r>
+    </w:p>
+    <w:p>
+      <w:pPr>
+        <w:pStyle w:val="CodeBlock"/>
+        <w:shd w:fill="F2F4F7"/>
+      </w:pPr>
+      <w:r>
+        <w:t xml:space="preserve">        var values = ReadFile(Path.Combine(AppContext.BaseDirectory, ".env"));</w:t>
+      </w:r>
+    </w:p>
+    <w:p>
+      <w:pPr>
+        <w:pStyle w:val="CodeBlock"/>
+        <w:shd w:fill="F2F4F7"/>
+      </w:pPr>
+      <w:r>
+        <w:t xml:space="preserve">        Apply(values, Environment.GetEnvironmentVariable, Environment.SetEnvironmentVariable);</w:t>
+      </w:r>
+    </w:p>
+    <w:p>
+      <w:pPr>
+        <w:pStyle w:val="CodeBlock"/>
+        <w:shd w:fill="F2F4F7"/>
+      </w:pPr>
+      <w:r>
+        <w:t xml:space="preserve">    }</w:t>
+      </w:r>
+    </w:p>
+    <w:p>
+      <w:pPr>
+        <w:pStyle w:val="CodeBlock"/>
+        <w:shd w:fill="F2F4F7"/>
+      </w:pPr>
+      <w:r>
+        <w:t xml:space="preserve"> </w:t>
+      </w:r>
+    </w:p>
+    <w:p>
+      <w:r/>
+      <w:r>
+        <w:rPr>
+          <w:rFonts w:ascii="Consolas" w:hAnsi="Consolas"/>
+          <w:sz w:val="18"/>
+        </w:rPr>
+        <w:t>ReadFile</w:t>
+      </w:r>
+      <w:r>
+        <w:t xml:space="preserve"> returns a dictionary and rejects invalid input without including secret values in errors. </w:t>
+      </w:r>
+      <w:r>
+        <w:rPr>
+          <w:rFonts w:ascii="Consolas" w:hAnsi="Consolas"/>
+          <w:sz w:val="18"/>
+        </w:rPr>
+        <w:t>Apply</w:t>
+      </w:r>
+      <w:r>
+        <w:t xml:space="preserve"> accepts injected getter/setter functions so precedence is tested without modifying the test process's real credentials. </w:t>
+      </w:r>
+      <w:r>
+        <w:rPr>
+          <w:rFonts w:ascii="Consolas" w:hAnsi="Consolas"/>
+          <w:sz w:val="18"/>
+        </w:rPr>
+        <w:t>Keys</w:t>
+      </w:r>
+      <w:r>
+        <w:t xml:space="preserve"> restricts the file to the three supported settings; </w:t>
+      </w:r>
+      <w:r>
+        <w:rPr>
+          <w:rFonts w:ascii="Consolas" w:hAnsi="Consolas"/>
+          <w:sz w:val="18"/>
+        </w:rPr>
+        <w:t>InvalidLine</w:t>
+      </w:r>
+      <w:r>
+        <w:t xml:space="preserve"> constructs errors containing only a line number.</w:t>
+      </w:r>
+    </w:p>
+    <w:p>
+      <w:pPr>
+        <w:pStyle w:val="Heading1"/>
+      </w:pPr>
+      <w:r>
         <w:t>Server configuration</w:t>
+      </w:r>
+    </w:p>
+    <w:p>
+      <w:pPr>
+        <w:pStyle w:val="Heading2"/>
+      </w:pPr>
+      <w:r>
+        <w:t>Optional .env file beside the executables</w:t>
+      </w:r>
+    </w:p>
+    <w:p>
+      <w:r>
+        <w:t xml:space="preserve">New builds also read </w:t>
+      </w:r>
+      <w:r>
+        <w:rPr>
+          <w:rFonts w:ascii="Consolas" w:hAnsi="Consolas"/>
+          <w:sz w:val="18"/>
+        </w:rPr>
+        <w:t>.env</w:t>
+      </w:r>
+      <w:r>
+        <w:t xml:space="preserve"> from the executable's directory, regardless of the terminal's working directory. Copy the included </w:t>
+      </w:r>
+      <w:r>
+        <w:rPr>
+          <w:rFonts w:ascii="Consolas" w:hAnsi="Consolas"/>
+          <w:sz w:val="18"/>
+        </w:rPr>
+        <w:t>.env.example</w:t>
+      </w:r>
+      <w:r>
+        <w:t xml:space="preserve"> to </w:t>
+      </w:r>
+      <w:r>
+        <w:rPr>
+          <w:rFonts w:ascii="Consolas" w:hAnsi="Consolas"/>
+          <w:sz w:val="18"/>
+        </w:rPr>
+        <w:t>.env</w:t>
+      </w:r>
+      <w:r>
+        <w:t xml:space="preserve"> and edit it:</w:t>
+      </w:r>
+    </w:p>
+    <w:p>
+      <w:pPr>
+        <w:pStyle w:val="CodeBlock"/>
+        <w:shd w:fill="F2F4F7"/>
+      </w:pPr>
+      <w:r>
+        <w:t>TYTAN_API_BASE_URL=https://tytan.poznan.pl/SQLupdate/</w:t>
+      </w:r>
+    </w:p>
+    <w:p>
+      <w:pPr>
+        <w:pStyle w:val="CodeBlock"/>
+        <w:shd w:fill="F2F4F7"/>
+      </w:pPr>
+      <w:r>
+        <w:t>TYTAN_API_USERNAME=TytanSQL</w:t>
+      </w:r>
+    </w:p>
+    <w:p>
+      <w:pPr>
+        <w:pStyle w:val="CodeBlock"/>
+        <w:shd w:fill="F2F4F7"/>
+      </w:pPr>
+      <w:r>
+        <w:t># Optional: uncomment only to store a password in plain text.</w:t>
+      </w:r>
+    </w:p>
+    <w:p>
+      <w:pPr>
+        <w:pStyle w:val="CodeBlock"/>
+        <w:shd w:fill="F2F4F7"/>
+      </w:pPr>
+      <w:r>
+        <w:t># TYTAN_API_PASSWORD=your-server-password</w:t>
+      </w:r>
+    </w:p>
+    <w:p>
+      <w:r>
+        <w:t xml:space="preserve">Restart the program after editing the file. Both programs use the same file when their executables are in the same directory. The desktop can then be started by double-clicking; enter the password in the window if it is omitted from </w:t>
+      </w:r>
+      <w:r>
+        <w:rPr>
+          <w:rFonts w:ascii="Consolas" w:hAnsi="Consolas"/>
+          <w:sz w:val="18"/>
+        </w:rPr>
+        <w:t>.env</w:t>
+      </w:r>
+      <w:r>
+        <w:t xml:space="preserve">. The console still requires a password from </w:t>
+      </w:r>
+      <w:r>
+        <w:rPr>
+          <w:rFonts w:ascii="Consolas" w:hAnsi="Consolas"/>
+          <w:sz w:val="18"/>
+        </w:rPr>
+        <w:t>.env</w:t>
+      </w:r>
+      <w:r>
+        <w:t xml:space="preserve"> or </w:t>
+      </w:r>
+      <w:r>
+        <w:rPr>
+          <w:rFonts w:ascii="Consolas" w:hAnsi="Consolas"/>
+          <w:sz w:val="18"/>
+        </w:rPr>
+        <w:t>TYTAN_API_PASSWORD</w:t>
+      </w:r>
+      <w:r>
+        <w:t xml:space="preserve"> in its environment. Its destination remains the optional third command-line argument; </w:t>
+      </w:r>
+      <w:r>
+        <w:rPr>
+          <w:rFonts w:ascii="Consolas" w:hAnsi="Consolas"/>
+          <w:sz w:val="18"/>
+        </w:rPr>
+        <w:t>.env</w:t>
+      </w:r>
+      <w:r>
+        <w:t xml:space="preserve"> does not configure a download directory.</w:t>
+      </w:r>
+    </w:p>
+    <w:p>
+      <w:r>
+        <w:t xml:space="preserve">Precedence is: existing process environment, then </w:t>
+      </w:r>
+      <w:r>
+        <w:rPr>
+          <w:rFonts w:ascii="Consolas" w:hAnsi="Consolas"/>
+          <w:sz w:val="18"/>
+        </w:rPr>
+        <w:t>.env</w:t>
+      </w:r>
+      <w:r>
+        <w:t xml:space="preserve">, then the built-in URL/username defaults. If an old environment value overrides your file, remove that variable in the terminal or start the program from a session without it. Under </w:t>
+      </w:r>
+      <w:r>
+        <w:rPr>
+          <w:rFonts w:ascii="Consolas" w:hAnsi="Consolas"/>
+          <w:sz w:val="18"/>
+        </w:rPr>
+        <w:t>dotnet run</w:t>
+      </w:r>
+      <w:r>
+        <w:t xml:space="preserve">, the executable directory is the project's build output directory, not the repository root; the root </w:t>
+      </w:r>
+      <w:r>
+        <w:rPr>
+          <w:rFonts w:ascii="Consolas" w:hAnsi="Consolas"/>
+          <w:sz w:val="18"/>
+        </w:rPr>
+        <w:t>.env.example</w:t>
+      </w:r>
+      <w:r>
+        <w:t xml:space="preserve"> is a template only and is not loaded automatically.</w:t>
+      </w:r>
+    </w:p>
+    <w:p>
+      <w:r>
+        <w:t xml:space="preserve">The supported keys are exactly </w:t>
+      </w:r>
+      <w:r>
+        <w:rPr>
+          <w:rFonts w:ascii="Consolas" w:hAnsi="Consolas"/>
+          <w:sz w:val="18"/>
+        </w:rPr>
+        <w:t>TYTAN_API_BASE_URL</w:t>
+      </w:r>
+      <w:r>
+        <w:t xml:space="preserve">, </w:t>
+      </w:r>
+      <w:r>
+        <w:rPr>
+          <w:rFonts w:ascii="Consolas" w:hAnsi="Consolas"/>
+          <w:sz w:val="18"/>
+        </w:rPr>
+        <w:t>TYTAN_API_USERNAME</w:t>
+      </w:r>
+      <w:r>
+        <w:t xml:space="preserve">, and </w:t>
+      </w:r>
+      <w:r>
+        <w:rPr>
+          <w:rFonts w:ascii="Consolas" w:hAnsi="Consolas"/>
+          <w:sz w:val="18"/>
+        </w:rPr>
+        <w:t>TYTAN_API_PASSWORD</w:t>
+      </w:r>
+      <w:r>
+        <w:t xml:space="preserve">. Use UTF-8, one </w:t>
+      </w:r>
+      <w:r>
+        <w:rPr>
+          <w:rFonts w:ascii="Consolas" w:hAnsi="Consolas"/>
+          <w:sz w:val="18"/>
+        </w:rPr>
+        <w:t>KEY=value</w:t>
+      </w:r>
+      <w:r>
+        <w:t xml:space="preserve"> per line; blank lines and lines beginning with </w:t>
+      </w:r>
+      <w:r>
+        <w:rPr>
+          <w:rFonts w:ascii="Consolas" w:hAnsi="Consolas"/>
+          <w:sz w:val="18"/>
+        </w:rPr>
+        <w:t>#</w:t>
+      </w:r>
+      <w:r>
+        <w:t xml:space="preserve"> are ignored. Optional matching single or double quotes preserve spaces inside values. </w:t>
+      </w:r>
+      <w:r>
+        <w:rPr>
+          <w:rFonts w:ascii="Consolas" w:hAnsi="Consolas"/>
+          <w:sz w:val="18"/>
+        </w:rPr>
+        <w:t>#</w:t>
+      </w:r>
+      <w:r>
+        <w:t xml:space="preserve">, </w:t>
+      </w:r>
+      <w:r>
+        <w:rPr>
+          <w:rFonts w:ascii="Consolas" w:hAnsi="Consolas"/>
+          <w:sz w:val="18"/>
+        </w:rPr>
+        <w:t>=</w:t>
+      </w:r>
+      <w:r>
+        <w:t>, backslashes, and dollar signs inside a value are literal. Inline comments and variable/escape expansion are not supported. Duplicate or unknown keys, malformed lines, unmatched opening quotes, control characters, invalid UTF-8, or files larger than 64 KiB produce a configuration error. The error identifies the line without printing its content. The file is parsed before any values are applied.</w:t>
+      </w:r>
+    </w:p>
+    <w:p>
+      <w:r>
+        <w:t xml:space="preserve">Only the credential-free </w:t>
+      </w:r>
+      <w:r>
+        <w:rPr>
+          <w:rFonts w:ascii="Consolas" w:hAnsi="Consolas"/>
+          <w:sz w:val="18"/>
+        </w:rPr>
+        <w:t>.env.example</w:t>
+      </w:r>
+      <w:r>
+        <w:t xml:space="preserve"> belongs in Git and distributable ZIPs. Private </w:t>
+      </w:r>
+      <w:r>
+        <w:rPr>
+          <w:rFonts w:ascii="Consolas" w:hAnsi="Consolas"/>
+          <w:sz w:val="18"/>
+        </w:rPr>
+        <w:t>.env</w:t>
+      </w:r>
+      <w:r>
+        <w:t xml:space="preserve"> and </w:t>
+      </w:r>
+      <w:r>
+        <w:rPr>
+          <w:rFonts w:ascii="Consolas" w:hAnsi="Consolas"/>
+          <w:sz w:val="18"/>
+        </w:rPr>
+        <w:t>.env.*</w:t>
+      </w:r>
+      <w:r>
+        <w:t xml:space="preserve"> files are ignored, and the publisher never copies them. A password entered into </w:t>
+      </w:r>
+      <w:r>
+        <w:rPr>
+          <w:rFonts w:ascii="Consolas" w:hAnsi="Consolas"/>
+          <w:sz w:val="18"/>
+        </w:rPr>
+        <w:t>.env</w:t>
+      </w:r>
+      <w:r>
+        <w:t xml:space="preserve"> is plain text; the program reads it but never writes or edits this file.</w:t>
       </w:r>
     </w:p>
     <w:p>
@@ -4085,7 +4521,7 @@
           </w:tcPr>
           <w:p>
             <w:r>
-              <w:t>Total Windows checks</w:t>
+              <w:t>ConfigurationChecks (shared)</w:t>
             </w:r>
           </w:p>
         </w:tc>
@@ -4095,7 +4531,39 @@
           </w:tcPr>
           <w:p>
             <w:r>
-              <w:t>109</w:t>
+              <w:t>16</w:t>
+            </w:r>
+          </w:p>
+        </w:tc>
+        <w:tc>
+          <w:tcPr>
+            <w:tcW w:type="dxa" w:w="3289"/>
+          </w:tcPr>
+          <w:p>
+            <w:r>
+              <w:t>Optional file, parsing, literal secrets, precedence, malformed/oversized/invalid UTF-8 inputs</w:t>
+            </w:r>
+          </w:p>
+        </w:tc>
+      </w:tr>
+      <w:tr>
+        <w:tc>
+          <w:tcPr>
+            <w:tcW w:type="dxa" w:w="3289"/>
+          </w:tcPr>
+          <w:p>
+            <w:r>
+              <w:t>Total distinct Windows checks</w:t>
+            </w:r>
+          </w:p>
+        </w:tc>
+        <w:tc>
+          <w:tcPr>
+            <w:tcW w:type="dxa" w:w="3289"/>
+          </w:tcPr>
+          <w:p>
+            <w:r>
+              <w:t>125</w:t>
             </w:r>
           </w:p>
         </w:tc>
@@ -4114,7 +4582,7 @@
     <w:p/>
     <w:p>
       <w:r>
-        <w:t xml:space="preserve">On October 12, both newly published win-x86 and win-x64 packages passed these 109 checks per architecture. The x86 run used WOW64 on the development computer. No live server request was made. Package filenames and hashes are recorded in </w:t>
+        <w:t xml:space="preserve">The earlier October 12 builds passed 109 checks per architecture. The current .env builds additionally pass the 16 shared configuration checks (125 distinct checks), plus published CLI startup integration checks. The x86 run used WOW64 on the development computer. No live server request was made. Package filenames and hashes are recorded in </w:t>
       </w:r>
       <w:hyperlink r:id="rId9">
         <w:r>
@@ -4182,7 +4650,17 @@
     </w:p>
     <w:p>
       <w:r>
-        <w:t>The script uses self-contained Release publishing, defaults to win-x64, accepts win-x86 and win-arm64, checks publish exit codes, copies two EXEs plus example/README, compresses a ZIP, and prints SHA256. It creates unique directories instead of deleting prior releases. Intermediate output is under ignored downloads/release-builds; releases are under ignored dist. Native runtime components may extract on launch. The original package's verification described above was on win-x64; the win-x86 package also passed all 91 Windows checks under WOW64 on the development computer. Acceptance testing on a customer computer running 32-bit Windows remains pending.</w:t>
+        <w:t xml:space="preserve">The script uses self-contained Release publishing, defaults to win-x64, accepts win-x86 and win-arm64, checks publish exit codes, copies two EXEs plus installation example, </w:t>
+      </w:r>
+      <w:r>
+        <w:rPr>
+          <w:rFonts w:ascii="Consolas" w:hAnsi="Consolas"/>
+          <w:sz w:val="18"/>
+        </w:rPr>
+        <w:t>.env.example</w:t>
+      </w:r>
+      <w:r>
+        <w:t>, and README, compresses a ZIP, and prints SHA256. It creates unique directories instead of deleting prior releases. Intermediate output is under ignored downloads/release-builds; releases are under ignored dist. Native runtime components may extract on launch. The original package's verification described above was on win-x64; the win-x86 package also passed all 91 Windows checks under WOW64 on the development computer. Acceptance testing on a customer computer running 32-bit Windows remains pending.</w:t>
       </w:r>
     </w:p>
     <w:p>

</xml_diff>

<commit_message>
Actualizar documentación tras limpiar paquetes antiguos y archivos generados
</commit_message>
<xml_diff>
--- a/documentation/technical-guide.docx
+++ b/documentation/technical-guide.docx
@@ -17,7 +17,17 @@
     </w:p>
     <w:p>
       <w:r>
-        <w:t>This guide describes the current source, including the October 12 configurable API URL and optional CLI destination parameter. Preserved October 9 ZIPs retain their original behavior and require replacement with a new build to use these additions. Historical release checks below are labelled separately.</w:t>
+        <w:t xml:space="preserve">This guide describes the current source, including the October 12 configurable API URL and optional CLI destination parameter. The current packages also include optional executable-side </w:t>
+      </w:r>
+      <w:r>
+        <w:rPr>
+          <w:rFonts w:ascii="Consolas" w:hAnsi="Consolas"/>
+          <w:sz w:val="18"/>
+        </w:rPr>
+        <w:t>.env</w:t>
+      </w:r>
+      <w:r>
+        <w:t xml:space="preserve"> configuration; obsolete local release artifacts have been removed. Historical release checks below are labelled separately.</w:t>
       </w:r>
     </w:p>
     <w:p>
@@ -898,7 +908,7 @@
     </w:p>
     <w:p>
       <w:r>
-        <w:t>The desktop does not save credentials or remember an installation configuration in this retained version. Each launch requires loading a file, choosing the example, or supplying an installation file argument at startup.</w:t>
+        <w:t>The desktop does not save credentials or remember an installation configuration in the current version. Each launch requires loading a file, choosing the example, or supplying an installation file argument at startup.</w:t>
       </w:r>
     </w:p>
     <w:p>
@@ -4608,7 +4618,7 @@
     </w:p>
     <w:p>
       <w:r>
-        <w:t>The retained release was checked after extraction: its console help, 24 CLI checks, and 67 desktop checks passed. Previous production verification listed the three packages above and downloaded Faktury_008.000.043.zip (17492922 bytes) successfully; installed example information remained unchanged. These are recorded results, not a new live request made for this guide. Acceptance on a representative customer PC remains necessary.</w:t>
+        <w:t>Historically, the original release was checked after extraction: its console help, 24 CLI checks, and 67 desktop checks passed. Previous production verification listed the three packages above and downloaded Faktury_008.000.043.zip (17492922 bytes) successfully; installed example information remained unchanged. These are recorded results, not a new live request made for this guide. Acceptance on a representative customer PC remains necessary.</w:t>
       </w:r>
     </w:p>
     <w:p>
@@ -4679,7 +4689,18 @@
     </w:p>
     <w:p>
       <w:r>
-        <w:t>The retained original ZIP is approximately 85.3 MiB, with SHA256 29A0E00943D989D0300CA11FE0AC78F8FB306BEB03E90B88733000A2A5F99D7E. It is preserved unchanged; the new user/technical guides are separate documentation artifacts.</w:t>
+        <w:t xml:space="preserve">Only the current win-x64 and win-x86 delivery ZIPs and their extracted directories are retained locally. Older releases and generated build/check artifacts have been removed. Current package filenames and SHA256 hashes are listed in </w:t>
+      </w:r>
+      <w:hyperlink r:id="rId9">
+        <w:r>
+          <w:rPr>
+            <w:rStyle w:val="Hyperlink"/>
+          </w:rPr>
+          <w:t>Windows distribution</w:t>
+        </w:r>
+      </w:hyperlink>
+      <w:r>
+        <w:t>.</w:t>
       </w:r>
     </w:p>
     <w:p>

</xml_diff>

<commit_message>
Retirar notas innecesarias sobre limpieza de archivos
</commit_message>
<xml_diff>
--- a/documentation/technical-guide.docx
+++ b/documentation/technical-guide.docx
@@ -27,7 +27,7 @@
         <w:t>.env</w:t>
       </w:r>
       <w:r>
-        <w:t xml:space="preserve"> configuration; obsolete local release artifacts have been removed. Historical release checks below are labelled separately.</w:t>
+        <w:t xml:space="preserve"> configuration. Historical release checks below are labelled separately.</w:t>
       </w:r>
     </w:p>
     <w:p>
@@ -4689,7 +4689,7 @@
     </w:p>
     <w:p>
       <w:r>
-        <w:t xml:space="preserve">Only the current win-x64 and win-x86 delivery ZIPs and their extracted directories are retained locally. Older releases and generated build/check artifacts have been removed. Current package filenames and SHA256 hashes are listed in </w:t>
+        <w:t xml:space="preserve">Current package filenames and SHA256 hashes are listed in </w:t>
       </w:r>
       <w:hyperlink r:id="rId9">
         <w:r>

</xml_diff>

<commit_message>
Sincronizar las guías con la configuración y opciones actuales
</commit_message>
<xml_diff>
--- a/documentation/technical-guide.docx
+++ b/documentation/technical-guide.docx
@@ -7,7 +7,7 @@
         <w:pStyle w:val="Title"/>
       </w:pPr>
       <w:r>
-        <w:t>Tytan Updater — Technical guide</w:t>
+        <w:t>Tytan Updater â€” Technical guide</w:t>
       </w:r>
     </w:p>
     <w:p>
@@ -27,7 +27,7 @@
         <w:t>.env</w:t>
       </w:r>
       <w:r>
-        <w:t xml:space="preserve"> configuration. Historical release checks below are labelled separately.</w:t>
+        <w:t xml:space="preserve"> configuration.</w:t>
       </w:r>
     </w:p>
     <w:p>
@@ -40,7 +40,7 @@
     </w:p>
     <w:p>
       <w:r>
-        <w:t>The system publishes existing Tytan update ZIPs over HTTPS, compares available package versions against explicitly supplied installed versions, and downloads newer packages. It consists of a PHP server, a Windows Forms client, and a Windows console client. The console also uses a Windows Save As dialog.</w:t>
+        <w:t>The system publishes existing Tytan update ZIPs over HTTPS, compares available package versions against explicitly supplied installed versions, and downloads newer packages. It consists of a PHP server, a Windows Forms client, and a Windows console client. The console uses a Windows Save As dialog only when no destination parameter is supplied.</w:t>
       </w:r>
     </w:p>
     <w:p>
@@ -175,7 +175,7 @@
         <w:shd w:fill="F2F4F7"/>
       </w:pPr>
       <w:r>
-        <w:t xml:space="preserve">                                        Windows Save As dialog</w:t>
+        <w:t xml:space="preserve">                                destination argument or Save As</w:t>
       </w:r>
     </w:p>
     <w:p>
@@ -216,7 +216,7 @@
     </w:p>
     <w:p>
       <w:r>
-        <w:t>The PHP server knows directories and files, not the installed client version. C# performs version selection. The Save As choice determines the local output path and is never sent as a server filesystem path.</w:t>
+        <w:t>The PHP server knows directories and files, not the installed client version. C# performs version selection. The destination argument or Save As choice determines the local output path and is never sent as a server filesystem path.</w:t>
       </w:r>
     </w:p>
     <w:tbl>
@@ -421,6 +421,50 @@
           </w:tcPr>
           <w:p>
             <w:r>
+              <w:t>desktop/Tytan.Updater.Desktop/StartupConfiguration.cs</w:t>
+            </w:r>
+          </w:p>
+        </w:tc>
+        <w:tc>
+          <w:tcPr>
+            <w:tcW w:type="dxa" w:w="4933"/>
+          </w:tcPr>
+          <w:p>
+            <w:r>
+              <w:t>Read executable-side .env and apply environment precedence</w:t>
+            </w:r>
+          </w:p>
+        </w:tc>
+      </w:tr>
+      <w:tr>
+        <w:tc>
+          <w:tcPr>
+            <w:tcW w:type="dxa" w:w="4933"/>
+          </w:tcPr>
+          <w:p>
+            <w:r>
+              <w:t>desktop/Tytan.Updater.Desktop/ConfigurationChecks.cs</w:t>
+            </w:r>
+          </w:p>
+        </w:tc>
+        <w:tc>
+          <w:tcPr>
+            <w:tcW w:type="dxa" w:w="4933"/>
+          </w:tcPr>
+          <w:p>
+            <w:r>
+              <w:t>Isolated shared configuration checks</w:t>
+            </w:r>
+          </w:p>
+        </w:tc>
+      </w:tr>
+      <w:tr>
+        <w:tc>
+          <w:tcPr>
+            <w:tcW w:type="dxa" w:w="4933"/>
+          </w:tcPr>
+          <w:p>
+            <w:r>
               <w:t>desktop/Tytan.Updater.Desktop/CloudApiClient.cs</w:t>
             </w:r>
           </w:p>
@@ -475,7 +519,7 @@
           </w:tcPr>
           <w:p>
             <w:r>
-              <w:t>Console entry, credentials from environment, Ctrl+C</w:t>
+              <w:t>Console entry, .env loading, credentials from merged environment, Ctrl+C</w:t>
             </w:r>
           </w:p>
         </w:tc>
@@ -497,7 +541,7 @@
           </w:tcPr>
           <w:p>
             <w:r>
-              <w:t>Two-argument input, query/compare/download orchestration, exit codes</w:t>
+              <w:t>Two required arguments, optional destination, query/compare/download orchestration, exit codes</w:t>
             </w:r>
           </w:p>
         </w:tc>
@@ -550,7 +594,7 @@
     <w:p/>
     <w:p>
       <w:r>
-        <w:t>The CLI project links the existing reader, comparison, listing, and download source files through its csproj. These files keep their Tytan.Updater.Desktop namespace; linking does not open the main desktop window or create a second implementation.</w:t>
+        <w:t>The CLI project links the shared configuration loader/checks, reader, comparison, listing, and download source files through its csproj. These files keep their Tytan.Updater.Desktop namespace; linking does not open the main desktop window or create a second implementation.</w:t>
       </w:r>
     </w:p>
     <w:p>
@@ -4592,7 +4636,7 @@
     <w:p/>
     <w:p>
       <w:r>
-        <w:t xml:space="preserve">The earlier October 12 builds passed 109 checks per architecture. The current .env builds additionally pass the 16 shared configuration checks (125 distinct checks), plus published CLI startup integration checks. The x86 run used WOW64 on the development computer. No live server request was made. Package filenames and hashes are recorded in </w:t>
+        <w:t xml:space="preserve">The current builds pass 125 distinct checks: 16 shared configuration checks, 67 desktop checks, and 42 CLI checks, plus published CLI startup integration checks. The shared suite runs in both executables. The x86 run used WOW64 on the development computer. No live server request was made. Package filenames and hashes are recorded in </w:t>
       </w:r>
       <w:hyperlink r:id="rId9">
         <w:r>
@@ -4618,7 +4662,7 @@
     </w:p>
     <w:p>
       <w:r>
-        <w:t>Historically, the original release was checked after extraction: its console help, 24 CLI checks, and 67 desktop checks passed. Previous production verification listed the three packages above and downloaded Faktury_008.000.043.zip (17492922 bytes) successfully; installed example information remained unchanged. These are recorded results, not a new live request made for this guide. Acceptance on a representative customer PC remains necessary.</w:t>
+        <w:t>Previous production verification listed the three packages above and downloaded Faktury_008.000.043.zip (17492922 bytes) successfully; installed example information remained unchanged. These are recorded results, not a new live request made for this guide. Acceptance on a representative customer PC remains necessary.</w:t>
       </w:r>
     </w:p>
     <w:p>
@@ -4670,7 +4714,7 @@
         <w:t>.env.example</w:t>
       </w:r>
       <w:r>
-        <w:t>, and README, compresses a ZIP, and prints SHA256. It creates unique directories instead of deleting prior releases. Intermediate output is under ignored downloads/release-builds; releases are under ignored dist. Native runtime components may extract on launch. The original package's verification described above was on win-x64; the win-x86 package also passed all 91 Windows checks under WOW64 on the development computer. Acceptance testing on a customer computer running 32-bit Windows remains pending.</w:t>
+        <w:t>, and README, compresses a ZIP, and prints SHA256. It creates unique directories instead of deleting prior releases. Intermediate output is under ignored downloads/release-builds; releases are under ignored dist. Native runtime components may extract on launch. Both published architectures passed all 125 distinct checks; the win-x86 run used WOW64 on the development computer. Acceptance testing on a customer computer running 32-bit Windows remains pending.</w:t>
       </w:r>
     </w:p>
     <w:p>
@@ -4713,7 +4757,37 @@
     </w:p>
     <w:p>
       <w:r>
-        <w:t>To adapt a definitive installed-version file, replace the JSON mapping in InstallationFileReader while preserving LocalInstallation semantics. To change the production endpoint base, update/inject CloudApiClient's base URI and validate the HTTPS contract. Do not change server version selection: it belongs in the client comparison layer.</w:t>
+        <w:t xml:space="preserve">To adapt a definitive installed-version file, replace the JSON mapping in InstallationFileReader while preserving LocalInstallation semantics. To change the production endpoint base, set </w:t>
+      </w:r>
+      <w:r>
+        <w:rPr>
+          <w:rFonts w:ascii="Consolas" w:hAnsi="Consolas"/>
+          <w:sz w:val="18"/>
+        </w:rPr>
+        <w:t>TYTAN_API_BASE_URL</w:t>
+      </w:r>
+      <w:r>
+        <w:t xml:space="preserve"> in </w:t>
+      </w:r>
+      <w:r>
+        <w:rPr>
+          <w:rFonts w:ascii="Consolas" w:hAnsi="Consolas"/>
+          <w:sz w:val="18"/>
+        </w:rPr>
+        <w:t>.env</w:t>
+      </w:r>
+      <w:r>
+        <w:t xml:space="preserve"> or the process environment. It must remain an HTTPS directory URL ending in </w:t>
+      </w:r>
+      <w:r>
+        <w:rPr>
+          <w:rFonts w:ascii="Consolas" w:hAnsi="Consolas"/>
+          <w:sz w:val="18"/>
+        </w:rPr>
+        <w:t>/</w:t>
+      </w:r>
+      <w:r>
+        <w:t xml:space="preserve"> and expose the existing API contract. Do not change server version selection: it belongs in the client comparison layer.</w:t>
       </w:r>
     </w:p>
     <w:p>
@@ -4796,7 +4870,7 @@
       <w:rPr>
         <w:sz w:val="16"/>
       </w:rPr>
-      <w:t>TYTAN UPDATER — TECHNICAL GUIDE</w:t>
+      <w:t>TYTAN UPDATER Â€” TECHNICAL GUIDE</w:t>
     </w:r>
   </w:p>
 </w:hdr>

</xml_diff>

<commit_message>
Simplificar los nombres de paquetes y carpetas de distribución
</commit_message>
<xml_diff>
--- a/documentation/technical-guide.docx
+++ b/documentation/technical-guide.docx
@@ -4714,7 +4714,17 @@
         <w:t>.env.example</w:t>
       </w:r>
       <w:r>
-        <w:t>, and README, compresses a ZIP, and prints SHA256. It creates unique directories instead of deleting prior releases. Intermediate output is under ignored downloads/release-builds; releases are under ignored dist. Native runtime components may extract on launch. Both published architectures passed all 125 distinct checks; the win-x86 run used WOW64 on the development computer. Acceptance testing on a customer computer running 32-bit Windows remains pending.</w:t>
+        <w:t xml:space="preserve">, and README, compresses a ZIP, and prints SHA256. Build staging uses a unique directory; delivery folders and ZIPs use stable names such as </w:t>
+      </w:r>
+      <w:r>
+        <w:rPr>
+          <w:rFonts w:ascii="Consolas" w:hAnsi="Consolas"/>
+          <w:sz w:val="18"/>
+        </w:rPr>
+        <w:t>TytanUpdater-win-x64</w:t>
+      </w:r>
+      <w:r>
+        <w:t>. Existing delivery directories or ZIPs must be moved elsewhere before publishing again. Intermediate output is under ignored downloads/release-builds; releases are under ignored dist. Native runtime components may extract on launch. Both published architectures passed all 125 distinct checks; the win-x86 run used WOW64 on the development computer. Acceptance testing on a customer computer running 32-bit Windows remains pending.</w:t>
       </w:r>
     </w:p>
     <w:p>

</xml_diff>

<commit_message>
Simplificar la guía de usuario y limpiar fechas y secciones de documentación
</commit_message>
<xml_diff>
--- a/documentation/technical-guide.docx
+++ b/documentation/technical-guide.docx
@@ -7,17 +7,12 @@
         <w:pStyle w:val="Title"/>
       </w:pPr>
       <w:r>
-        <w:t>Tytan Updater â€” Technical guide</w:t>
+        <w:t>Tytan Updater - Technical guide</w:t>
       </w:r>
     </w:p>
     <w:p>
       <w:r>
-        <w:t>Updated: October 12, 2026.</w:t>
-      </w:r>
-    </w:p>
-    <w:p>
-      <w:r>
-        <w:t xml:space="preserve">This guide describes the current source, including the October 12 configurable API URL and optional CLI destination parameter. The current packages also include optional executable-side </w:t>
+        <w:t xml:space="preserve">This guide describes the current source, including the configurable API URL and optional CLI destination parameter. The current packages also include optional executable-side </w:t>
       </w:r>
       <w:r>
         <w:rPr>
@@ -2490,6 +2485,21 @@
       </w:r>
     </w:p>
     <w:p>
+      <w:r>
+        <w:t xml:space="preserve">In this response template, </w:t>
+      </w:r>
+      <w:r>
+        <w:rPr>
+          <w:rFonts w:ascii="Consolas" w:hAnsi="Consolas"/>
+          <w:sz w:val="18"/>
+        </w:rPr>
+        <w:t>&lt;UTC timestamp&gt;</w:t>
+      </w:r>
+      <w:r>
+        <w:t xml:space="preserve"> stands for the modification time returned by the server.</w:t>
+      </w:r>
+    </w:p>
+    <w:p>
       <w:pPr>
         <w:pStyle w:val="CodeBlock"/>
         <w:shd w:fill="F2F4F7"/>
@@ -2540,7 +2550,7 @@
         <w:shd w:fill="F2F4F7"/>
       </w:pPr>
       <w:r>
-        <w:t xml:space="preserve">    "modified": "2026-10-02 06:57:29",</w:t>
+        <w:t xml:space="preserve">    "modified": "&lt;UTC timestamp&gt;",</w:t>
       </w:r>
     </w:p>
     <w:p>
@@ -4880,7 +4890,7 @@
       <w:rPr>
         <w:sz w:val="16"/>
       </w:rPr>
-      <w:t>TYTAN UPDATER Â€” TECHNICAL GUIDE</w:t>
+      <w:t>TYTAN UPDATER - TECHNICAL GUIDE</w:t>
     </w:r>
   </w:p>
 </w:hdr>

</xml_diff>